<commit_message>
Complete Module 3 deliverable
</commit_message>
<xml_diff>
--- a/GIT 337.docx
+++ b/GIT 337.docx
@@ -181,7 +181,19 @@
         <w:rPr>
           <w:rFonts w:ascii="Arial" w:hAnsi="Arial" w:cs="Arial"/>
         </w:rPr>
-        <w:t>The final decisions about the form’s fields, required and optional information, labels, grouping, constraints, states, error recovery, design-system application, and responsive behavior were made by me. I tested the implementation in the browser at 320px, 768px, 1280px, and 200% zoom; tested empty, malformed, minimum-boundary, maximum-boundary, and valid submissions; completing keyboard-only testing; and inspected accessible names using Chrome Developer Tools was also carried out by myself. I also validated my HTML and CSS with the W3C validators and corrected issues identified during testing. I verified the submitted implementation and am responsible for understanding and explaining the HTML, CSS, form behavior, accessibility decisions, validation constraints, and testing results.</w:t>
+        <w:t>The final decisions about the form’s fields, required and optional information, labels, grouping, constraints, states, error recovery, design-system application, and responsive behavior were made by me. I tested the implementation in the browser at 320px, 768px, 1280px, and 200% zoom; tested empty, malformed, minimum-boundary, maximum-boundary, and valid submissions; complet</w:t>
+      </w:r>
+      <w:r>
+        <w:rPr>
+          <w:rFonts w:ascii="Arial" w:hAnsi="Arial" w:cs="Arial"/>
+        </w:rPr>
+        <w:t>ed</w:t>
+      </w:r>
+      <w:r>
+        <w:rPr>
+          <w:rFonts w:ascii="Arial" w:hAnsi="Arial" w:cs="Arial"/>
+        </w:rPr>
+        <w:t xml:space="preserve"> keyboard-only testing; and inspected accessible names using Chrome Developer Tools was also carried out by myself. I also validated my HTML and CSS with the W3C validators and corrected issues identified during testing. I verified the submitted implementation and am responsible for understanding and explaining the HTML, CSS, form behavior, accessibility decisions, validation constraints, and testing results.</w:t>
       </w:r>
     </w:p>
     <w:p>

</xml_diff>